<commit_message>
Update supporting materials and repository metadata
</commit_message>
<xml_diff>
--- a/docs/Supporting_Materials.docx
+++ b/docs/Supporting_Materials.docx
@@ -114,16 +114,18 @@
         </w:rPr>
         <w:t xml:space="preserve">Code repository: </w:t>
       </w:r>
-      <w:r>
-        <w:rPr>
-          <w:rFonts w:ascii="Times New Roman" w:hAnsi="Times New Roman"/>
-          <w:b w:val="0"/>
-          <w:i/>
-          <w:color w:val="1F4E79"/>
-          <w:sz w:val="21"/>
-        </w:rPr>
-        <w:t>[GITHUB REPOSITORY URL TO BE ADDED BEFORE PUBLIC RELEASE]</w:t>
-      </w:r>
+      <w:hyperlink r:id="rId29">
+        <w:r>
+          <w:rPr>
+            <w:rFonts w:ascii="Times New Roman" w:hAnsi="Times New Roman"/>
+            <w:b w:val="0"/>
+            <w:color w:val="0563C1"/>
+            <w:sz w:val="21"/>
+            <w:u w:val="single"/>
+          </w:rPr>
+          <w:t>https://github.com/kakram1986/privacy-preserving-federated-learning-cifar10</w:t>
+        </w:r>
+      </w:hyperlink>
     </w:p>
     <w:p>
       <w:pPr>
@@ -12102,7 +12104,7 @@
           <w:color w:val="1F1F1F"/>
           <w:sz w:val="21"/>
         </w:rPr>
-        <w:t>The public repository will be linked below after the final project repository is created or confirmed. It should contain the source modules, environment specification, notebook entry points, a README with execution order, and a compact set of non-sensitive result tables. Large checkpoints and duplicate generated figures should be released through a tagged archive or project storage rather than committed directly to Git history.</w:t>
+        <w:t>The public repository provides the audited source modules, dependency specification, notebook entry points, execution guidance, reconciled result tables, selected figures, and evidence-boundary records. Large model checkpoints and duplicate generated artefacts are excluded from Git history; the repository README and reproducibility guide state the execution sequence and the limits of the retained environment record.</w:t>
       </w:r>
     </w:p>
     <w:p>
@@ -12120,16 +12122,18 @@
         </w:rPr>
         <w:t xml:space="preserve">GitHub repository: </w:t>
       </w:r>
-      <w:r>
-        <w:rPr>
-          <w:rFonts w:ascii="Times New Roman" w:hAnsi="Times New Roman"/>
-          <w:b w:val="0"/>
-          <w:i/>
-          <w:color w:val="1F4E79"/>
-          <w:sz w:val="22"/>
-        </w:rPr>
-        <w:t>[GITHUB REPOSITORY URL TO BE ADDED BEFORE PUBLIC RELEASE]</w:t>
-      </w:r>
+      <w:hyperlink r:id="rId29">
+        <w:r>
+          <w:rPr>
+            <w:rFonts w:ascii="Times New Roman" w:hAnsi="Times New Roman"/>
+            <w:b w:val="0"/>
+            <w:color w:val="0563C1"/>
+            <w:sz w:val="22"/>
+            <w:u w:val="single"/>
+          </w:rPr>
+          <w:t>https://github.com/kakram1986/privacy-preserving-federated-learning-cifar10</w:t>
+        </w:r>
+      </w:hyperlink>
     </w:p>
     <w:p>
       <w:pPr>

</xml_diff>